<commit_message>
Atualização no card de próxima entrada
</commit_message>
<xml_diff>
--- a/Documentação Técnica EstoqueVision.docx
+++ b/Documentação Técnica EstoqueVision.docx
@@ -40,11 +40,7 @@
         </w:rPr>
       </w:pPr>
       <w:r>
-        <w:rPr>
-          <w:b/>
-          <w:bCs/>
-        </w:rPr>
-        <w:t>Documentação Técnica e Executiva – Versão 3.0</w:t>
+        <w:t>Documentação Técnica e Executiva – Versão 3.1</w:t>
       </w:r>
     </w:p>
     <w:p>
@@ -3408,11 +3404,7 @@
         </w:rPr>
       </w:pPr>
       <w:r>
-        <w:rPr>
-          <w:b/>
-          <w:bCs/>
-        </w:rPr>
-        <w:t>ESTOQUEVISION v3.0</w:t>
+        <w:t>ESTOQUEVISION v3.1</w:t>
       </w:r>
     </w:p>
     <w:p>
@@ -3508,6 +3500,49 @@
       </w:r>
     </w:p>
     <w:p/>
+    <w:p>
+      <w:pPr>
+        <w:pStyle w:val="Ttulo1"/>
+      </w:pPr>
+      <w:r>
+        <w:t>11. Atualizações da Versão 3.1</w:t>
+      </w:r>
+    </w:p>
+    <w:p>
+      <w:r>
+        <w:t>• Padronização completa para o padrão brasileiro de números (kg, toneladas, moeda e percentuais).</w:t>
+      </w:r>
+    </w:p>
+    <w:p>
+      <w:r>
+        <w:t>• Correção da previsão de estoque para utilizar quantidades em kg.</w:t>
+      </w:r>
+    </w:p>
+    <w:p>
+      <w:r>
+        <w:t>• Inclusão de filtro exclusivo por produto na seção Raio-X Operacional.</w:t>
+      </w:r>
+    </w:p>
+    <w:p>
+      <w:r>
+        <w:t>• Correção do cálculo do Capital Imobilizado (Quantidade × Custo Unitário).</w:t>
+      </w:r>
+    </w:p>
+    <w:p>
+      <w:r>
+        <w:t>• Exibição do custo unitário apenas quando um produto estiver selecionado.</w:t>
+      </w:r>
+    </w:p>
+    <w:p>
+      <w:r>
+        <w:t>• Remoção da aba Custos.</w:t>
+      </w:r>
+    </w:p>
+    <w:p>
+      <w:r>
+        <w:t>• Padronização de cards, gráficos, tabelas e tooltips.</w:t>
+      </w:r>
+    </w:p>
     <w:sectPr>
       <w:pgSz w:w="11906" w:h="16838"/>
       <w:pgMar w:top="1417" w:right="1701" w:bottom="1417" w:left="1701" w:header="708" w:footer="708" w:gutter="0"/>

</xml_diff>